<commit_message>
Updated class documents and months/days in spanish
Annoying .DS_Stor file keeps popping up
I have to deal with that later...
</commit_message>
<xml_diff>
--- a/class documents/enrollment form.docx
+++ b/class documents/enrollment form.docx
@@ -214,7 +214,7 @@
                 <w:szCs w:val="12"/>
                 <w:rtl w:val="0"/>
               </w:rPr>
-              <w:t xml:space="preserve">Inicio - Termino</w:t>
+              <w:t xml:space="preserve">Start/Year - End/Year</w:t>
             </w:r>
           </w:p>
           <w:p>
@@ -239,7 +239,7 @@
                 <w:szCs w:val="12"/>
                 <w:rtl w:val="0"/>
               </w:rPr>
-              <w:t xml:space="preserve">{Day1} y {Day2} </w:t>
+              <w:t xml:space="preserve">Dia1 y Dia2 </w:t>
             </w:r>
           </w:p>
           <w:p>

</xml_diff>